<commit_message>
chore(auto): actualizar cartas con 64 estudiantes y 20 firmas [2026-10-22 20:18]
</commit_message>
<xml_diff>
--- a/cartas_solicitud/Carta_Solicitud_ELE0300733_MAQUINAS_ELECTRICAS_II_TP.docx
+++ b/cartas_solicitud/Carta_Solicitud_ELE0300733_MAQUINAS_ELECTRICAS_II_TP.docx
@@ -88,7 +88,7 @@
         <w:br/>
         <w:t>• Semestre del Plan de Estudios: Semestre 7°</w:t>
         <w:br/>
-        <w:t>• Total de Estudiantes Solicitantes Preinscritos: 13 estudiantes</w:t>
+        <w:t>• Total de Estudiantes Solicitantes Preinscritos: 14 estudiantes</w:t>
       </w:r>
     </w:p>
     <w:p>
@@ -97,7 +97,7 @@
         <w:jc w:val="both"/>
       </w:pPr>
       <w:r>
-        <w:t>Manifestamos nuestro compromiso formal de matrícula y cumplimiento con los requerimientos académicos y arancelarios correspondientes al curso vacacional. Dado que contamos con un grupo sólido de 13 estudiantes interesados (superando el cupo mínimo requerido de 10 estudiantes), solicitamos su valiosa gestión ante la Coordinación Académica y la Dirección de Programa para su respectiva aprobación, asignación docente y programación de horarios.</w:t>
+        <w:t>Manifestamos nuestro compromiso formal de matrícula y cumplimiento con los requerimientos académicos y arancelarios correspondientes al curso vacacional. Dado que contamos con un grupo sólido de 14 estudiantes interesados (superando el cupo mínimo requerido de 10 estudiantes), solicitamos su valiosa gestión ante la Coordinación Académica y la Dirección de Programa para su respectiva aprobación, asignación docente y programación de horarios.</w:t>
       </w:r>
     </w:p>
     <w:p>
@@ -1841,6 +1841,149 @@
           </w:p>
         </w:tc>
       </w:tr>
+      <w:tr>
+        <w:tc>
+          <w:tcPr>
+            <w:tcW w:type="dxa" w:w="576"/>
+            <w:tcMar>
+              <w:top w:w="100" w:type="dxa"/>
+              <w:bottom w:w="100" w:type="dxa"/>
+              <w:left w:w="80" w:type="dxa"/>
+              <w:right w:w="80" w:type="dxa"/>
+            </w:tcMar>
+            <w:shd w:fill="F9FAF8"/>
+          </w:tcPr>
+          <w:p>
+            <w:pPr>
+              <w:jc w:val="center"/>
+            </w:pPr>
+            <w:r>
+              <w:rPr>
+                <w:sz w:val="17"/>
+              </w:rPr>
+              <w:t>14</w:t>
+            </w:r>
+          </w:p>
+        </w:tc>
+        <w:tc>
+          <w:tcPr>
+            <w:tcW w:type="dxa" w:w="3312"/>
+            <w:tcMar>
+              <w:top w:w="100" w:type="dxa"/>
+              <w:bottom w:w="100" w:type="dxa"/>
+              <w:left w:w="80" w:type="dxa"/>
+              <w:right w:w="80" w:type="dxa"/>
+            </w:tcMar>
+            <w:shd w:fill="F9FAF8"/>
+          </w:tcPr>
+          <w:p>
+            <w:r>
+              <w:rPr>
+                <w:b/>
+                <w:sz w:val="17"/>
+              </w:rPr>
+              <w:t>Cristhian camilo Alvarez naranjo</w:t>
+            </w:r>
+          </w:p>
+        </w:tc>
+        <w:tc>
+          <w:tcPr>
+            <w:tcW w:type="dxa" w:w="1728"/>
+            <w:tcMar>
+              <w:top w:w="100" w:type="dxa"/>
+              <w:bottom w:w="100" w:type="dxa"/>
+              <w:left w:w="80" w:type="dxa"/>
+              <w:right w:w="80" w:type="dxa"/>
+            </w:tcMar>
+            <w:shd w:fill="F9FAF8"/>
+          </w:tcPr>
+          <w:p>
+            <w:pPr>
+              <w:jc w:val="center"/>
+            </w:pPr>
+            <w:r>
+              <w:rPr>
+                <w:sz w:val="17"/>
+              </w:rPr>
+              <w:t>1110546856</w:t>
+            </w:r>
+          </w:p>
+        </w:tc>
+        <w:tc>
+          <w:tcPr>
+            <w:tcW w:type="dxa" w:w="1584"/>
+            <w:tcMar>
+              <w:top w:w="100" w:type="dxa"/>
+              <w:bottom w:w="100" w:type="dxa"/>
+              <w:left w:w="80" w:type="dxa"/>
+              <w:right w:w="80" w:type="dxa"/>
+            </w:tcMar>
+            <w:shd w:fill="F9FAF8"/>
+          </w:tcPr>
+          <w:p>
+            <w:pPr>
+              <w:jc w:val="center"/>
+            </w:pPr>
+            <w:r>
+              <w:rPr>
+                <w:sz w:val="17"/>
+              </w:rPr>
+              <w:t>3214597005</w:t>
+            </w:r>
+          </w:p>
+        </w:tc>
+        <w:tc>
+          <w:tcPr>
+            <w:tcW w:type="dxa" w:w="2592"/>
+            <w:tcMar>
+              <w:top w:w="100" w:type="dxa"/>
+              <w:bottom w:w="100" w:type="dxa"/>
+              <w:left w:w="80" w:type="dxa"/>
+              <w:right w:w="80" w:type="dxa"/>
+            </w:tcMar>
+            <w:shd w:fill="F9FAF8"/>
+          </w:tcPr>
+          <w:p>
+            <w:pPr>
+              <w:jc w:val="center"/>
+            </w:pPr>
+            <w:r>
+              <w:drawing>
+                <wp:inline xmlns:a="http://schemas.openxmlformats.org/drawingml/2006/main" xmlns:pic="http://schemas.openxmlformats.org/drawingml/2006/picture">
+                  <wp:extent cx="1371299" cy="292608"/>
+                  <wp:docPr id="4" name="Picture 4"/>
+                  <wp:cNvGraphicFramePr>
+                    <a:graphicFrameLocks noChangeAspect="1"/>
+                  </wp:cNvGraphicFramePr>
+                  <a:graphic>
+                    <a:graphicData uri="http://schemas.openxmlformats.org/drawingml/2006/picture">
+                      <pic:pic>
+                        <pic:nvPicPr>
+                          <pic:cNvPr id="0" name="image.png"/>
+                          <pic:cNvPicPr/>
+                        </pic:nvPicPr>
+                        <pic:blipFill>
+                          <a:blip r:embed="rId12"/>
+                          <a:stretch>
+                            <a:fillRect/>
+                          </a:stretch>
+                        </pic:blipFill>
+                        <pic:spPr>
+                          <a:xfrm>
+                            <a:off x="0" y="0"/>
+                            <a:ext cx="1371299" cy="292608"/>
+                          </a:xfrm>
+                          <a:prstGeom prst="rect"/>
+                        </pic:spPr>
+                      </pic:pic>
+                    </a:graphicData>
+                  </a:graphic>
+                </wp:inline>
+              </w:drawing>
+            </w:r>
+          </w:p>
+        </w:tc>
+      </w:tr>
     </w:tbl>
     <w:p>
       <w:pPr>

</xml_diff>